<commit_message>
Committee chat restricted to committee; owner-granted committee permissions; lodge-wide chat; guide updated
Co-Authored-By: Claude Fable 5 <noreply@anthropic.com>
</commit_message>
<xml_diff>
--- a/Composite Lodge 4076 - User Guide.docx
+++ b/Composite Lodge 4076 - User Guide.docx
@@ -323,7 +323,7 @@
           <w:b w:val="0"/>
           <w:i w:val="0"/>
         </w:rPr>
-        <w:t>The bar across the top shows the lodge crest and name, the gold ⟳ Sync button, and who is signed in. The menu down the left-hand side takes you to each section: Members, Meetings, Events, Lodge Notices, Photos and Settings. On a phone, tap the ☰ button to open this menu.</w:t>
+        <w:t>The bar across the top shows the lodge crest and name, the gold ⟳ Sync button, and who is signed in. The menu down the left-hand side takes you to each section: Members, Meetings, Events, Lodge Chat, Lodge Notices, Photos and Settings. On a phone, tap the ☰ button to open this menu.</w:t>
       </w:r>
     </w:p>
     <w:p>
@@ -585,7 +585,7 @@
         <w:t>Committee</w:t>
       </w:r>
       <w:r>
-        <w:t xml:space="preserve"> — add lodge members from the dropdown (their phone numbers come straight from the Members list), or add someone from outside the lodge. Non-members are marked with a * after their name.</w:t>
+        <w:t xml:space="preserve"> — lodge members are added from a dropdown (their phone numbers come straight from the Members list), and people from outside the lodge can be added too — non-members are marked with a * after their name. Only the Secretary, and members he has given permission to in Settings, can add or remove committee members.</w:t>
       </w:r>
     </w:p>
     <w:p>
@@ -627,7 +627,24 @@
         <w:t>Committee chat</w:t>
       </w:r>
       <w:r>
-        <w:t xml:space="preserve"> — type a message and press Send. Messages carry your name and reach the rest of the committee when they next sync. Your messages appear in navy on the right, everyone else’s on the left.</w:t>
+        <w:t xml:space="preserve"> — private to that event’s committee: you only see it if you are on the committee. Type a message and press Send — it carries your name and reaches the rest of the committee when they next sync. Your messages appear in navy on the right, everyone else’s on the left.</w:t>
+      </w:r>
+    </w:p>
+    <w:p>
+      <w:pPr>
+        <w:pStyle w:val="Heading1"/>
+      </w:pPr>
+      <w:r>
+        <w:t>Lodge Chat</w:t>
+      </w:r>
+    </w:p>
+    <w:p>
+      <w:r>
+        <w:rPr>
+          <w:b w:val="0"/>
+          <w:i w:val="0"/>
+        </w:rPr>
+        <w:t>A chat for the whole lodge, open to every member — it works exactly like the committee chat. Choose Lodge Chat in the left-hand menu, type your message and press Send. Messages reach the brethren when they next press Sync, so don’t expect an instant reply — it is more noticeboard conversation than instant messenger.</w:t>
       </w:r>
     </w:p>
     <w:p>
@@ -740,6 +757,20 @@
       </w:r>
       <w:r>
         <w:t xml:space="preserve"> — shows when this device last synced.</w:t>
+      </w:r>
+    </w:p>
+    <w:p>
+      <w:pPr>
+        <w:pStyle w:val="ListBullet"/>
+      </w:pPr>
+      <w:r>
+        <w:rPr>
+          <w:b/>
+        </w:rPr>
+        <w:t>Permissions</w:t>
+      </w:r>
+      <w:r>
+        <w:t xml:space="preserve"> — the Secretary only: choose which members are allowed to add and remove people on event committees (and therefore who is in each committee chat). Everyone else can see committees but not change them.</w:t>
       </w:r>
     </w:p>
     <w:p>

</xml_diff>

<commit_message>
Members listed alphabetically; split guides (brethren + Secretary); fix service worker serving stale app updates
Co-Authored-By: Claude Fable 5 <noreply@anthropic.com>
</commit_message>
<xml_diff>
--- a/Composite Lodge 4076 - User Guide.docx
+++ b/Composite Lodge 4076 - User Guide.docx
@@ -109,6 +109,9 @@
           </w:tcPr>
           <w:p>
             <w:r>
+              <w:rPr>
+                <w:b w:val="0"/>
+              </w:rPr>
               <w:t xml:space="preserve">The app syncs itself automatically every time you open it, and every few minutes while it is open — so normally you need do nothing. The gold </w:t>
             </w:r>
             <w:r>
@@ -119,6 +122,9 @@
               <w:t>⟳ Sync</w:t>
             </w:r>
             <w:r>
+              <w:rPr>
+                <w:b w:val="0"/>
+              </w:rPr>
               <w:t xml:space="preserve"> button at the top right forces a sync right now: press it before you close the app after making changes, or when you want the very latest from everyone else.</w:t>
             </w:r>
           </w:p>
@@ -340,7 +346,7 @@
           <w:b w:val="0"/>
           <w:i w:val="0"/>
         </w:rPr>
-        <w:t>The members list shows each brother’s name, contact number, email, rank and office. It is ordered by rank automatically — most senior at the top (Grand Rank first, then Provincial, Past Master, Master Mason, Fellow Craft, Entered Apprentice). Phone numbers and emails are tappable — one tap rings or emails the brother.</w:t>
+        <w:t>The members list shows each brother’s name, contact number, email, rank and office, listed alphabetically. Phone numbers and emails are tappable — one tap rings or emails the brother.</w:t>
       </w:r>
     </w:p>
     <w:p>
@@ -351,10 +357,10 @@
         <w:rPr>
           <w:b/>
         </w:rPr>
-        <w:t>Add member</w:t>
+        <w:t>Your own details</w:t>
       </w:r>
       <w:r>
-        <w:t xml:space="preserve"> — type the details in yourself and press Add.</w:t>
+        <w:t xml:space="preserve"> — if the Secretary sends you a details form link, fill it in once and you appear in the list automatically. You can also ask him to update your details at any time.</w:t>
       </w:r>
     </w:p>
     <w:p>
@@ -365,24 +371,10 @@
         <w:rPr>
           <w:b/>
         </w:rPr>
-        <w:t>Edit</w:t>
+        <w:t>Add member / Edit</w:t>
       </w:r>
       <w:r>
-        <w:t xml:space="preserve"> — change a brother’s details or remove him from the list.</w:t>
-      </w:r>
-    </w:p>
-    <w:p>
-      <w:pPr>
-        <w:pStyle w:val="ListBullet"/>
-      </w:pPr>
-      <w:r>
-        <w:rPr>
-          <w:b/>
-        </w:rPr>
-        <w:t>Share details form</w:t>
-      </w:r>
-      <w:r>
-        <w:t xml:space="preserve"> — the easy way to fill the list. This copies a link you can paste into WhatsApp or an email to all the brethren. Each brother opens it, enters the passcode, fills in his name, number, email, rank and office, and presses Submit. His details appear in the members list the next time you press Sync — no retyping.</w:t>
+        <w:t xml:space="preserve"> — details can be added or corrected directly in the app too.</w:t>
       </w:r>
     </w:p>
     <w:p>
@@ -495,7 +487,7 @@
           <w:b w:val="0"/>
           <w:i w:val="0"/>
         </w:rPr>
-        <w:t>Everything saves automatically as you type — just remember to Sync.</w:t>
+        <w:t>Everything saves automatically as you type — just remember it reaches the others on the next sync.</w:t>
       </w:r>
     </w:p>
     <w:p>
@@ -571,7 +563,7 @@
           <w:b w:val="0"/>
           <w:i w:val="0"/>
         </w:rPr>
-        <w:t>Press “+ New event” and give it a name, date, time, location and notes. Each event page has:</w:t>
+        <w:t>Each event page has:</w:t>
       </w:r>
     </w:p>
     <w:p>
@@ -585,7 +577,7 @@
         <w:t>Committee</w:t>
       </w:r>
       <w:r>
-        <w:t xml:space="preserve"> — lodge members are added from a dropdown (their phone numbers come straight from the Members list), and people from outside the lodge can be added too — non-members are marked with a * after their name. Only the Secretary, and members he has given permission to in Settings, can add or remove committee members.</w:t>
+        <w:t xml:space="preserve"> — who is organising the event. Lodge members show with their phone numbers (pulled from the Members list); anyone from outside the lodge is marked with a * after their name. The committee is set by the Secretary and any brethren he has given permission to.</w:t>
       </w:r>
     </w:p>
     <w:p>
@@ -599,7 +591,7 @@
         <w:t>Event details</w:t>
       </w:r>
       <w:r>
-        <w:t xml:space="preserve"> — the date, time, location and notes, with an Edit button to change them.</w:t>
+        <w:t xml:space="preserve"> — the date, time, location and notes.</w:t>
       </w:r>
     </w:p>
     <w:p>
@@ -644,7 +636,7 @@
           <w:b w:val="0"/>
           <w:i w:val="0"/>
         </w:rPr>
-        <w:t>A chat for the whole lodge, open to every member — it works exactly like the committee chat. Choose Lodge Chat in the left-hand menu, type your message and press Send. Messages reach the brethren when they next press Sync, so don’t expect an instant reply — it is more noticeboard conversation than instant messenger.</w:t>
+        <w:t>A chat for the whole lodge, open to every member — it works exactly like the committee chat. Choose Lodge Chat in the left-hand menu, type your message and press Send. Messages reach the brethren when they next sync, so don’t expect an instant reply — it is more noticeboard conversation than instant messenger.</w:t>
       </w:r>
     </w:p>
     <w:p>
@@ -661,49 +653,7 @@
           <w:b w:val="0"/>
           <w:i w:val="0"/>
         </w:rPr>
-        <w:t>For information the brethren need — Provincial communications, Almoner’s updates, subscription reminders.</w:t>
-      </w:r>
-    </w:p>
-    <w:p>
-      <w:pPr>
-        <w:pStyle w:val="ListBullet"/>
-      </w:pPr>
-      <w:r>
-        <w:rPr>
-          <w:b/>
-        </w:rPr>
-        <w:t>New notice</w:t>
-      </w:r>
-      <w:r>
-        <w:t xml:space="preserve"> — give it a title, write the notice, and optionally attach a document (PDF, Word or an image, up to 3 MB). Members open attachments with one tap.</w:t>
-      </w:r>
-    </w:p>
-    <w:p>
-      <w:pPr>
-        <w:pStyle w:val="ListBullet"/>
-      </w:pPr>
-      <w:r>
-        <w:rPr>
-          <w:b/>
-        </w:rPr>
-        <w:t>Pin</w:t>
-      </w:r>
-      <w:r>
-        <w:t xml:space="preserve"> — keeps an important notice at the top of the list with a gold edge.</w:t>
-      </w:r>
-    </w:p>
-    <w:p>
-      <w:pPr>
-        <w:pStyle w:val="ListBullet"/>
-      </w:pPr>
-      <w:r>
-        <w:rPr>
-          <w:b/>
-        </w:rPr>
-        <w:t>Delete</w:t>
-      </w:r>
-      <w:r>
-        <w:t xml:space="preserve"> — removes a notice once it is out of date.</w:t>
+        <w:t>Announcements the brethren need — Provincial communications, Almoner’s updates, subscription reminders. Notices can carry an attached document (PDF, Word or an image) — tap the attachment to open it. Pinned notices stay at the top with a gold edge.</w:t>
       </w:r>
     </w:p>
     <w:p>
@@ -720,7 +670,7 @@
           <w:b w:val="0"/>
           <w:i w:val="0"/>
         </w:rPr>
-        <w:t>This section will link to a shared album on the lodge Google account, where photos can be viewed, added and filtered by date. Until that account is set up, the tab shows a waiting message. When the account is ready, the Secretary pastes the album link into Settings and the button appears for everyone after their next sync.</w:t>
+        <w:t>This section will link to a shared album on the lodge Google account, where photos can be viewed, added and filtered by date. Until that is set up, the tab shows a waiting message.</w:t>
       </w:r>
     </w:p>
     <w:p>
@@ -767,52 +717,10 @@
         <w:rPr>
           <w:b/>
         </w:rPr>
-        <w:t>Permissions</w:t>
-      </w:r>
-      <w:r>
-        <w:t xml:space="preserve"> — the Secretary only: choose which members are allowed to add and remove people on event committees (and therefore who is in each committee chat). Everyone else can see committees but not change them.</w:t>
-      </w:r>
-    </w:p>
-    <w:p>
-      <w:pPr>
-        <w:pStyle w:val="ListBullet"/>
-      </w:pPr>
-      <w:r>
-        <w:rPr>
-          <w:b/>
-        </w:rPr>
-        <w:t>Photos album link</w:t>
-      </w:r>
-      <w:r>
-        <w:t xml:space="preserve"> — where the Google Photos album link goes (Secretary only, once the account exists).</w:t>
-      </w:r>
-    </w:p>
-    <w:p>
-      <w:pPr>
-        <w:pStyle w:val="ListBullet"/>
-      </w:pPr>
-      <w:r>
-        <w:rPr>
-          <w:b/>
-        </w:rPr>
-        <w:t>Backup</w:t>
-      </w:r>
-      <w:r>
-        <w:t xml:space="preserve"> — downloads a backup file of all lodge data, and can restore from one. A monthly backup is a sensible habit for the Secretary.</w:t>
-      </w:r>
-    </w:p>
-    <w:p>
-      <w:pPr>
-        <w:pStyle w:val="ListBullet"/>
-      </w:pPr>
-      <w:r>
-        <w:rPr>
-          <w:b/>
-        </w:rPr>
         <w:t>Passcode</w:t>
       </w:r>
       <w:r>
-        <w:t xml:space="preserve"> — the passcode is shared by the whole lodge. To change it, ask the Secretary to arrange an app update.</w:t>
+        <w:t xml:space="preserve"> — the passcode is shared by the whole lodge; speak to the Secretary if you have forgotten it.</w:t>
       </w:r>
     </w:p>
     <w:p>

</xml_diff>

<commit_message>
To-Do section, @mentions with tagging suggestions, notifications bell with device pop-up option; guide updated
Co-Authored-By: Claude Fable 5 <noreply@anthropic.com>
</commit_message>
<xml_diff>
--- a/Composite Lodge 4076 - User Guide.docx
+++ b/Composite Lodge 4076 - User Guide.docx
@@ -329,7 +329,50 @@
           <w:b w:val="0"/>
           <w:i w:val="0"/>
         </w:rPr>
-        <w:t>The bar across the top shows the lodge crest and name, the gold ⟳ Sync button, and who is signed in. The menu down the left-hand side takes you to each section: Members, Meetings, Events, Lodge Chat, Lodge Notices, Photos and Settings. On a phone, tap the ☰ button to open this menu.</w:t>
+        <w:t>The bar across the top shows the lodge crest and name, the 🔔 notifications bell, the gold ⟳ Sync button, and who is signed in. The menu down the left-hand side takes you to each section: Members, Meetings, Events, To-Do, Lodge Chat, Lodge Notices, Photos and Settings. On a phone, tap the ☰ button to open this menu.</w:t>
+      </w:r>
+    </w:p>
+    <w:p>
+      <w:pPr>
+        <w:pStyle w:val="Heading1"/>
+      </w:pPr>
+      <w:r>
+        <w:t>Notifications — the 🔔 bell</w:t>
+      </w:r>
+    </w:p>
+    <w:p>
+      <w:r>
+        <w:rPr>
+          <w:b w:val="0"/>
+          <w:i w:val="0"/>
+        </w:rPr>
+        <w:t>The bell at the top collects everything addressed to you: tasks a brother has given you, messages where you were tagged, new notices, and photo album updates. A red number on the bell shows how many are new — tap the bell to read them, and tap any notification to jump straight to it.</w:t>
+      </w:r>
+    </w:p>
+    <w:p>
+      <w:r>
+        <w:rPr>
+          <w:b w:val="0"/>
+          <w:i w:val="0"/>
+        </w:rPr>
+        <w:t>Notifications arrive when the app syncs — automatically on opening and every few minutes while open. If you would also like a pop-up on your device when something new arrives, turn on “Device notifications” in Settings.</w:t>
+      </w:r>
+    </w:p>
+    <w:p>
+      <w:pPr>
+        <w:pStyle w:val="Heading1"/>
+      </w:pPr>
+      <w:r>
+        <w:t>Tagging a brother with @</w:t>
+      </w:r>
+    </w:p>
+    <w:p>
+      <w:r>
+        <w:rPr>
+          <w:b w:val="0"/>
+          <w:i w:val="0"/>
+        </w:rPr>
+        <w:t>In any chat message or task, type @ and start typing a name — the members list pops up, and one tap inserts the name. The tagged brother sees it highlighted in gold, and it appears under his 🔔 bell so he knows he has been mentioned or given a job.</w:t>
       </w:r>
     </w:p>
     <w:p>
@@ -504,7 +547,7 @@
           <w:b w:val="0"/>
           <w:i w:val="0"/>
         </w:rPr>
-        <w:t>Every to-do list in the app works the same way. Each task has a tick box, the name of the brother it is assigned to, the task itself, and a due date. Overdue dates show in red.</w:t>
+        <w:t>The To-Do section in the menu is the lodge’s general list — anyone can add a task to it. Meetings and events each have their own list as well, and every list works the same way. Each task has a tick box, the name of the brother it is assigned to, the task itself, and a due date. Overdue dates show in red. Assigning a task to a brother, or tagging him with @ in the task, notifies him under his 🔔 bell.</w:t>
       </w:r>
     </w:p>
     <w:p>
@@ -707,6 +750,20 @@
       </w:r>
       <w:r>
         <w:t xml:space="preserve"> — shows when this device last synced.</w:t>
+      </w:r>
+    </w:p>
+    <w:p>
+      <w:pPr>
+        <w:pStyle w:val="ListBullet"/>
+      </w:pPr>
+      <w:r>
+        <w:rPr>
+          <w:b/>
+        </w:rPr>
+        <w:t>Device notifications</w:t>
+      </w:r>
+      <w:r>
+        <w:t xml:space="preserve"> — turn on to get a pop-up on your device when something new arrives while the app is open in the background.</w:t>
       </w:r>
     </w:p>
     <w:p>

</xml_diff>

<commit_message>
Web push: device subscriptions, push service worker handler, change-only sync commits with [notify] flag
Co-Authored-By: Claude Fable 5 <noreply@anthropic.com>
</commit_message>
<xml_diff>
--- a/Composite Lodge 4076 - User Guide.docx
+++ b/Composite Lodge 4076 - User Guide.docx
@@ -355,7 +355,7 @@
           <w:b w:val="0"/>
           <w:i w:val="0"/>
         </w:rPr>
-        <w:t>Notifications arrive when the app syncs — automatically on opening and every few minutes while open. If you would also like a pop-up on your device when something new arrives, turn on “Device notifications” in Settings.</w:t>
+        <w:t>For notifications that reach you even when the app is closed — like a WhatsApp message — turn on “Device notifications” in Settings and allow notifications when your phone asks. On iPhone this only works from the installed app (Share → Add to Home Screen first); on Android and computers it works straight away.</w:t>
       </w:r>
     </w:p>
     <w:p>
@@ -763,7 +763,7 @@
         <w:t>Device notifications</w:t>
       </w:r>
       <w:r>
-        <w:t xml:space="preserve"> — turn on to get a pop-up on your device when something new arrives while the app is open in the background.</w:t>
+        <w:t xml:space="preserve"> — turn on to get notifications on your device even when the app is closed. iPhone: install the app to your Home Screen first.</w:t>
       </w:r>
     </w:p>
     <w:p>

</xml_diff>

<commit_message>
Guide: everyone should enable device notifications
Co-Authored-By: Claude Fable 5 <noreply@anthropic.com>
</commit_message>
<xml_diff>
--- a/Composite Lodge 4076 - User Guide.docx
+++ b/Composite Lodge 4076 - User Guide.docx
@@ -317,6 +317,21 @@
     </w:p>
     <w:p>
       <w:pPr>
+        <w:ind w:left="576" w:hanging="317"/>
+      </w:pPr>
+      <w:r>
+        <w:rPr>
+          <w:b/>
+          <w:color w:val="1E2A6E"/>
+        </w:rPr>
+        <w:t xml:space="preserve">4.  </w:t>
+      </w:r>
+      <w:r>
+        <w:t>Finally — everyone should do this — go to Settings, find “Device notifications” and press Enable, then allow notifications when your phone asks. This is how you’ll know when a brother gives you a task, tags you, or posts a notice, even with the app closed.</w:t>
+      </w:r>
+    </w:p>
+    <w:p>
+      <w:pPr>
         <w:pStyle w:val="Heading1"/>
       </w:pPr>
       <w:r>
@@ -355,7 +370,7 @@
           <w:b w:val="0"/>
           <w:i w:val="0"/>
         </w:rPr>
-        <w:t>For notifications that reach you even when the app is closed — like a WhatsApp message — turn on “Device notifications” in Settings and allow notifications when your phone asks. On iPhone this only works from the installed app (Share → Add to Home Screen first); on Android and computers it works straight away.</w:t>
+        <w:t>For notifications that reach you even when the app is closed — like a WhatsApp message — turn on “Device notifications” in Settings and allow notifications when your phone asks. Every member should switch this on: it is how tasks and messages reach you between meetings. On iPhone it only works from the installed app (Share → Add to Home Screen first); on Android and computers it works straight away.</w:t>
       </w:r>
     </w:p>
     <w:p>

</xml_diff>